<commit_message>
Notice et fiche : thème ModListeAction, instance de revoyure, N° d'action, test sur version publiée
Co-Authored-By: Claude Opus 5.5 <noreply@anthropic.com>
Claude-Session: https://claude.ai/code/session_01GKfrYG79ACwYQtm1cXoLGF
</commit_message>
<xml_diff>
--- a/docs/Fiche_Bonnes_pratiques_PowerApps.docx
+++ b/docs/Fiche_Bonnes_pratiques_PowerApps.docx
@@ -2168,6 +2168,36 @@
           <w:b/>
           <w:bCs/>
         </w:rPr>
+        <w:t xml:space="preserve">Tester la bonne version</w:t>
+      </w:r>
+      <w:r>
+        <w:t xml:space="preserve"> : « Enregistrer » ne suffit pas, les utilisateurs utilisent la version </w:t>
+      </w:r>
+      <w:r>
+        <w:rPr>
+          <w:b/>
+          <w:bCs/>
+        </w:rPr>
+        <w:t xml:space="preserve">publiée</w:t>
+      </w:r>
+      <w:r>
+        <w:t xml:space="preserve">. Tester en aperçu dans Studio, puis publier, relancer l’application et refaire le test.</w:t>
+      </w:r>
+    </w:p>
+    <w:p>
+      <w:pPr>
+        <w:pStyle w:val="ListParagraph"/>
+        <w:numPr>
+          <w:ilvl w:val="0"/>
+          <w:numId w:val="2"/>
+        </w:numPr>
+        <w:spacing w:after="60"/>
+      </w:pPr>
+      <w:r>
+        <w:rPr>
+          <w:b/>
+          <w:bCs/>
+        </w:rPr>
         <w:t xml:space="preserve">Constantes</w:t>
       </w:r>
       <w:r>
@@ -2258,6 +2288,19 @@
       </w:pPr>
       <w:r>
         <w:t xml:space="preserve">Test en aperçu (F5) : filtrer, cocher et décocher, ouvrir, modifier, enregistrer, revenir.</w:t>
+      </w:r>
+    </w:p>
+    <w:p>
+      <w:pPr>
+        <w:pStyle w:val="ListParagraph"/>
+        <w:numPr>
+          <w:ilvl w:val="0"/>
+          <w:numId w:val="3"/>
+        </w:numPr>
+        <w:spacing w:after="60"/>
+      </w:pPr>
+      <w:r>
+        <w:t xml:space="preserve">Après publication : application relancée et test refait sur la version publiée.</w:t>
       </w:r>
     </w:p>
     <w:p>

</xml_diff>